<commit_message>
Intro ING PI: el enunciado del estudiante deja de citar Clase/Sesion N
El enunciado tenia que leerse junto al calendario para entender cuando pasaba
cada cosa ("cierra en la Clase 6", "Clases 3 y 11", etc.), y esos numeros ya
cambiaron una vez este semestre con la reestructuracion a 11 sesiones. Se
reescribe para que se explique por si solo: las etapas se numeran 1-4 en su
propio orden, los hitos se anclan a Corte 1/2/3 (que ya es el concepto
estable de peso, no de calendario), y los momentos puntuales (asistente de
IA) quedan como "los que anuncie el docente" en vez de una Clase fija. La
guia docente (Kit docente/, privada) si conserva los numeros de sesion: ahi
es su trabajo real, mapear el proyecto generico al calendario concreto.

Verificado: sin @@, sin Meet, sin ninguna mencion a Clase/Sesion N.
</commit_message>
<xml_diff>
--- a/Introduccion a la Ingenieria/Clases/Proyecto Integrador/Enunciado Proyecto Integrador - Introduccion a la Ingenieria - 2026-2.docx
+++ b/Introduccion a la Ingenieria/Clases/Proyecto Integrador/Enunciado Proyecto Integrador - Introduccion a la Ingenieria - 2026-2.docx
@@ -151,7 +151,7 @@
           <w:color w:val="2B2B2B"/>
           <w:sz w:val="22"/>
         </w:rPr>
-        <w:t>Este curso no se aprueba con un examen final: se aprueba con un proyecto de equipo que arranca en la Clase 1 y se defiende en la Clase 15. Es una propuesta de mejora tecnológica para un problema real del entorno de ustedes. No hay que programarla: hay que diseñarla y defenderla con evidencia.</w:t>
+        <w:t>Este curso no se aprueba con un examen final: se aprueba con un proyecto de equipo que arranca desde la primera sesión y se defiende en la última semana de clases. Es una propuesta de mejora tecnológica para un problema real del entorno de ustedes. No hay que programarla: hay que diseñarla y defenderla con evidencia.</w:t>
       </w:r>
     </w:p>
     <w:p>
@@ -196,7 +196,7 @@
           <w:color w:val="2B2B2B"/>
           <w:sz w:val="22"/>
         </w:rPr>
-        <w:t>En la Clase 1, en equipo, llenan una ficha sobre uno de los cinco campos de acción de la Ingeniería de Sistemas: qué hace ese campo, un día de trabajo típico, un problema real del entorno que podría mejorar (con quién lo sufre y una cifra que lo mida), una confusión frecuente sobre ese campo y una consecuencia concreta de hacerlo mal. Esa ficha queda guardada.</w:t>
+        <w:t>Al comienzo del curso, en equipo, llenan una ficha sobre uno de los cinco campos de acción de la Ingeniería de Sistemas: qué hace ese campo, un día de trabajo típico, un problema real del entorno que podría mejorar (con quién lo sufre y una cifra que lo mida), una confusión frecuente sobre ese campo y una consecuencia concreta de hacerlo mal. Esa ficha queda guardada.</w:t>
       </w:r>
     </w:p>
     <w:p>
@@ -211,7 +211,7 @@
           <w:color w:val="2B2B2B"/>
           <w:sz w:val="22"/>
         </w:rPr>
-        <w:t>En la Clase 6 las cinco fichas del equipo vuelven a la mesa: el equipo elige de ahí el problema real que va a trabajar todo el semestre. El campo sorteado en la Clase 1 es solo el objeto de esa actividad — no compromete el tema del proyecto.</w:t>
+        <w:t>Al cerrar la primera etapa del curso, las cinco fichas del equipo vuelven a la mesa: el equipo elige de ahí el problema real que va a trabajar todo el semestre. El campo sorteado al comienzo es solo el objeto de esa actividad — no compromete el tema del proyecto.</w:t>
       </w:r>
     </w:p>
     <w:p>
@@ -226,7 +226,7 @@
           <w:color w:val="095292"/>
           <w:sz w:val="24"/>
         </w:rPr>
-        <w:t>3. Cómo se construye, sesión por sesión</w:t>
+        <w:t>3. Cómo se construye, etapa por etapa</w:t>
       </w:r>
     </w:p>
     <w:tbl>
@@ -236,14 +236,13 @@
         <w:tblLook w:firstColumn="1" w:firstRow="1" w:lastColumn="0" w:lastRow="0" w:noHBand="0" w:noVBand="1" w:val="04A0"/>
       </w:tblPr>
       <w:tblGrid>
-        <w:gridCol w:w="3264"/>
-        <w:gridCol w:w="3264"/>
-        <w:gridCol w:w="3264"/>
+        <w:gridCol w:w="4896"/>
+        <w:gridCol w:w="4896"/>
       </w:tblGrid>
       <w:tr>
         <w:tc>
           <w:tcPr>
-            <w:tcW w:type="dxa" w:w="3264"/>
+            <w:tcW w:type="dxa" w:w="4896"/>
             <w:shd w:val="clear" w:fill="095292"/>
           </w:tcPr>
           <w:p>
@@ -261,25 +260,7 @@
         </w:tc>
         <w:tc>
           <w:tcPr>
-            <w:tcW w:type="dxa" w:w="3264"/>
-            <w:shd w:val="clear" w:fill="095292"/>
-          </w:tcPr>
-          <w:p>
-            <w:r/>
-            <w:r>
-              <w:rPr>
-                <w:rFonts w:ascii="Calibri" w:hAnsi="Calibri" w:eastAsia="Calibri"/>
-                <w:b/>
-                <w:color w:val="FFFFFF"/>
-                <w:sz w:val="20"/>
-              </w:rPr>
-              <w:t>Sesiones</w:t>
-            </w:r>
-          </w:p>
-        </w:tc>
-        <w:tc>
-          <w:tcPr>
-            <w:tcW w:type="dxa" w:w="3264"/>
+            <w:tcW w:type="dxa" w:w="4896"/>
             <w:shd w:val="clear" w:fill="095292"/>
           </w:tcPr>
           <w:p>
@@ -299,7 +280,7 @@
       <w:tr>
         <w:tc>
           <w:tcPr>
-            <w:tcW w:type="dxa" w:w="3264"/>
+            <w:tcW w:type="dxa" w:w="4896"/>
           </w:tcPr>
           <w:p>
             <w:r/>
@@ -310,13 +291,13 @@
                 <w:color w:val="2B2B2B"/>
                 <w:sz w:val="20"/>
               </w:rPr>
-              <w:t>Problema y propuesta inicial</w:t>
+              <w:t>1 · Problema y propuesta inicial</w:t>
             </w:r>
           </w:p>
         </w:tc>
         <w:tc>
           <w:tcPr>
-            <w:tcW w:type="dxa" w:w="3264"/>
+            <w:tcW w:type="dxa" w:w="4896"/>
           </w:tcPr>
           <w:p>
             <w:r/>
@@ -327,24 +308,7 @@
                 <w:color w:val="2B2B2B"/>
                 <w:sz w:val="20"/>
               </w:rPr>
-              <w:t>1 a 4</w:t>
-            </w:r>
-          </w:p>
-        </w:tc>
-        <w:tc>
-          <w:tcPr>
-            <w:tcW w:type="dxa" w:w="3264"/>
-          </w:tcPr>
-          <w:p>
-            <w:r/>
-            <w:r>
-              <w:rPr>
-                <w:rFonts w:ascii="Calibri" w:hAnsi="Calibri" w:eastAsia="Calibri"/>
-                <w:b w:val="0"/>
-                <w:color w:val="2B2B2B"/>
-                <w:sz w:val="20"/>
-              </w:rPr>
-              <w:t>Problema del entorno con su cifra, a quién le pasa y las causas principales (cierra el Corte 1 en la Clase 6).</w:t>
+              <w:t>Problema del entorno con su cifra, a quién le pasa y las causas principales. Con esto cierra el Corte 1.</w:t>
             </w:r>
           </w:p>
         </w:tc>
@@ -352,7 +316,7 @@
       <w:tr>
         <w:tc>
           <w:tcPr>
-            <w:tcW w:type="dxa" w:w="3264"/>
+            <w:tcW w:type="dxa" w:w="4896"/>
             <w:shd w:val="clear" w:fill="F2F2F2"/>
           </w:tcPr>
           <w:p>
@@ -364,13 +328,13 @@
                 <w:color w:val="2B2B2B"/>
                 <w:sz w:val="20"/>
               </w:rPr>
-              <w:t>Ciclo de vida y prototipo</w:t>
+              <w:t>2 · Ciclo de vida y prototipo</w:t>
             </w:r>
           </w:p>
         </w:tc>
         <w:tc>
           <w:tcPr>
-            <w:tcW w:type="dxa" w:w="3264"/>
+            <w:tcW w:type="dxa" w:w="4896"/>
             <w:shd w:val="clear" w:fill="F2F2F2"/>
           </w:tcPr>
           <w:p>
@@ -382,14 +346,15 @@
                 <w:color w:val="2B2B2B"/>
                 <w:sz w:val="20"/>
               </w:rPr>
-              <w:t>5 a 7</w:t>
+              <w:t>Requisitos, alternativas y decisión, prototipo de baja fidelidad probado con una persona ajena al equipo. Con esto cierra el Corte 2.</w:t>
             </w:r>
           </w:p>
         </w:tc>
+      </w:tr>
+      <w:tr>
         <w:tc>
           <w:tcPr>
-            <w:tcW w:type="dxa" w:w="3264"/>
-            <w:shd w:val="clear" w:fill="F2F2F2"/>
+            <w:tcW w:type="dxa" w:w="4896"/>
           </w:tcPr>
           <w:p>
             <w:r/>
@@ -400,49 +365,13 @@
                 <w:color w:val="2B2B2B"/>
                 <w:sz w:val="20"/>
               </w:rPr>
-              <w:t>Requisitos, alternativas y decisión, prototipo de baja fidelidad probado con una persona ajena al equipo (cierra el Corte 2 en la Clase 11).</w:t>
-            </w:r>
-          </w:p>
-        </w:tc>
-      </w:tr>
-      <w:tr>
-        <w:tc>
-          <w:tcPr>
-            <w:tcW w:type="dxa" w:w="3264"/>
-          </w:tcPr>
-          <w:p>
-            <w:r/>
-            <w:r>
-              <w:rPr>
-                <w:rFonts w:ascii="Calibri" w:hAnsi="Calibri" w:eastAsia="Calibri"/>
-                <w:b w:val="0"/>
-                <w:color w:val="2B2B2B"/>
-                <w:sz w:val="20"/>
-              </w:rPr>
-              <w:t>Evaluación de impacto y ensayo</w:t>
+              <w:t>3 · Evaluación de impacto y ensayo</w:t>
             </w:r>
           </w:p>
         </w:tc>
         <w:tc>
           <w:tcPr>
-            <w:tcW w:type="dxa" w:w="3264"/>
-          </w:tcPr>
-          <w:p>
-            <w:r/>
-            <w:r>
-              <w:rPr>
-                <w:rFonts w:ascii="Calibri" w:hAnsi="Calibri" w:eastAsia="Calibri"/>
-                <w:b w:val="0"/>
-                <w:color w:val="2B2B2B"/>
-                <w:sz w:val="20"/>
-              </w:rPr>
-              <w:t>8 a 10</w:t>
-            </w:r>
-          </w:p>
-        </w:tc>
-        <w:tc>
-          <w:tcPr>
-            <w:tcW w:type="dxa" w:w="3264"/>
+            <w:tcW w:type="dxa" w:w="4896"/>
           </w:tcPr>
           <w:p>
             <w:r/>
@@ -461,7 +390,7 @@
       <w:tr>
         <w:tc>
           <w:tcPr>
-            <w:tcW w:type="dxa" w:w="3264"/>
+            <w:tcW w:type="dxa" w:w="4896"/>
             <w:shd w:val="clear" w:fill="F2F2F2"/>
           </w:tcPr>
           <w:p>
@@ -473,13 +402,13 @@
                 <w:color w:val="2B2B2B"/>
                 <w:sz w:val="20"/>
               </w:rPr>
-              <w:t>Exposición final e informe</w:t>
+              <w:t>4 · Exposición final e informe</w:t>
             </w:r>
           </w:p>
         </w:tc>
         <w:tc>
           <w:tcPr>
-            <w:tcW w:type="dxa" w:w="3264"/>
+            <w:tcW w:type="dxa" w:w="4896"/>
             <w:shd w:val="clear" w:fill="F2F2F2"/>
           </w:tcPr>
           <w:p>
@@ -491,25 +420,7 @@
                 <w:color w:val="2B2B2B"/>
                 <w:sz w:val="20"/>
               </w:rPr>
-              <w:t>11 (doble)</w:t>
-            </w:r>
-          </w:p>
-        </w:tc>
-        <w:tc>
-          <w:tcPr>
-            <w:tcW w:type="dxa" w:w="3264"/>
-            <w:shd w:val="clear" w:fill="F2F2F2"/>
-          </w:tcPr>
-          <w:p>
-            <w:r/>
-            <w:r>
-              <w:rPr>
-                <w:rFonts w:ascii="Calibri" w:hAnsi="Calibri" w:eastAsia="Calibri"/>
-                <w:b w:val="0"/>
-                <w:color w:val="2B2B2B"/>
-                <w:sz w:val="20"/>
-              </w:rPr>
-              <w:t>Defensa en vivo del proyecto (Clase 15) e informe final armado en clase (Clase 16).</w:t>
+              <w:t>Defensa en vivo del proyecto y el informe final armado en clase. Con esto cierra el Corte 3 y el curso.</w:t>
             </w:r>
           </w:p>
         </w:tc>
@@ -533,7 +444,7 @@
           <w:color w:val="2B2B2B"/>
           <w:sz w:val="22"/>
         </w:rPr>
-        <w:t>Las fechas exactas de cada sesión son las de SU grupo: revise el CALENDARIO_2026-2 de SB141B, SB141C o LB141F, según corresponda.</w:t>
+        <w:t>Las fechas exactas de cada etapa están en el calendario de su grupo.</w:t>
       </w:r>
     </w:p>
     <w:p>
@@ -548,7 +459,7 @@
           <w:color w:val="095292"/>
           <w:sz w:val="24"/>
         </w:rPr>
-        <w:t>4. El informe final — 12 secciones (Clase 16, 20% del curso)</w:t>
+        <w:t>4. El informe final — 12 secciones (20% del curso)</w:t>
       </w:r>
     </w:p>
     <w:tbl>
@@ -1306,7 +1217,7 @@
           <w:color w:val="095292"/>
           <w:sz w:val="24"/>
         </w:rPr>
-        <w:t>5. La exposición final (Clase 15, 15% del curso)</w:t>
+        <w:t>5. La exposición final (15% del curso)</w:t>
       </w:r>
     </w:p>
     <w:p>
@@ -1771,7 +1682,7 @@
           <w:color w:val="2B2B2B"/>
           <w:sz w:val="22"/>
         </w:rPr>
-        <w:t>Asistente de IA (Gemini/Claude/ChatGPT, plan gratuito): solo en las Clases 3 y 11, con declaración de qué se pidió y qué se corrigió a mano.</w:t>
+        <w:t>Asistente de IA (Gemini/Claude/ChatGPT, plan gratuito): solo en los momentos puntuales que anuncie el docente, con declaración de qué se pidió y qué se corrigió a mano.</w:t>
       </w:r>
     </w:p>
     <w:p>
@@ -1862,7 +1773,7 @@
           <w:color w:val="2B2B2B"/>
           <w:sz w:val="22"/>
         </w:rPr>
-        <w:t>La autoevaluación individual de la Clase 16 sí se entrega solo al docente, uno por integrante.</w:t>
+        <w:t>La autoevaluación individual del cierre del proyecto sí se entrega solo al docente, uno por integrante.</w:t>
       </w:r>
     </w:p>
     <w:p>
@@ -1922,7 +1833,7 @@
           <w:color w:val="2B2B2B"/>
           <w:sz w:val="22"/>
         </w:rPr>
-        <w:t>No reemplaza las evaluaciones de corte de ExamLab de las Clases 6 y 11 (Cortes 1 y 2): son evaluaciones distintas del mismo semestre.</w:t>
+        <w:t>No reemplaza las evaluaciones de corte de ExamLab de los Cortes 1 y 2: son evaluaciones distintas del mismo semestre.</w:t>
       </w:r>
     </w:p>
     <w:p>

</xml_diff>

<commit_message>
Intro ING PI: quita la seccion de la ficha semilla del enunciado del estudiante
Esa mecanica (ficha de 5 campos de accion, sorteo, retoma) es material propio
del curso, no del Proyecto Integrador: duplicarla en el enunciado del PI
mezclaba dos documentos con audiencia y ciclo de vida distintos. El enunciado
pasa de 8 a 7 secciones, renumeradas.
</commit_message>
<xml_diff>
--- a/Introduccion a la Ingenieria/Clases/Proyecto Integrador/Enunciado Proyecto Integrador - Introduccion a la Ingenieria - 2026-2.docx
+++ b/Introduccion a la Ingenieria/Clases/Proyecto Integrador/Enunciado Proyecto Integrador - Introduccion a la Ingenieria - 2026-2.docx
@@ -181,52 +181,7 @@
           <w:color w:val="095292"/>
           <w:sz w:val="24"/>
         </w:rPr>
-        <w:t>2. De dónde sale el tema: la ficha semilla</w:t>
-      </w:r>
-    </w:p>
-    <w:p>
-      <w:pPr>
-        <w:spacing w:after="120" w:before="0"/>
-        <w:jc w:val="left"/>
-      </w:pPr>
-      <w:r>
-        <w:rPr>
-          <w:rFonts w:ascii="Calibri" w:hAnsi="Calibri" w:eastAsia="Calibri"/>
-          <w:b w:val="0"/>
-          <w:color w:val="2B2B2B"/>
-          <w:sz w:val="22"/>
-        </w:rPr>
-        <w:t>Al comienzo del curso, en equipo, llenan una ficha sobre uno de los cinco campos de acción de la Ingeniería de Sistemas: qué hace ese campo, un día de trabajo típico, un problema real del entorno que podría mejorar (con quién lo sufre y una cifra que lo mida), una confusión frecuente sobre ese campo y una consecuencia concreta de hacerlo mal. Esa ficha queda guardada.</w:t>
-      </w:r>
-    </w:p>
-    <w:p>
-      <w:pPr>
-        <w:spacing w:after="120" w:before="0"/>
-        <w:jc w:val="left"/>
-      </w:pPr>
-      <w:r>
-        <w:rPr>
-          <w:rFonts w:ascii="Calibri" w:hAnsi="Calibri" w:eastAsia="Calibri"/>
-          <w:b w:val="0"/>
-          <w:color w:val="2B2B2B"/>
-          <w:sz w:val="22"/>
-        </w:rPr>
-        <w:t>Al cerrar la primera etapa del curso, las cinco fichas del equipo vuelven a la mesa: el equipo elige de ahí el problema real que va a trabajar todo el semestre. El campo sorteado al comienzo es solo el objeto de esa actividad — no compromete el tema del proyecto.</w:t>
-      </w:r>
-    </w:p>
-    <w:p>
-      <w:pPr>
-        <w:spacing w:after="120" w:before="240"/>
-        <w:jc w:val="left"/>
-      </w:pPr>
-      <w:r>
-        <w:rPr>
-          <w:rFonts w:ascii="Calibri" w:hAnsi="Calibri" w:eastAsia="Calibri"/>
-          <w:b/>
-          <w:color w:val="095292"/>
-          <w:sz w:val="24"/>
-        </w:rPr>
-        <w:t>3. Cómo se construye, etapa por etapa</w:t>
+        <w:t>2. Cómo se construye, etapa por etapa</w:t>
       </w:r>
     </w:p>
     <w:tbl>
@@ -459,7 +414,7 @@
           <w:color w:val="095292"/>
           <w:sz w:val="24"/>
         </w:rPr>
-        <w:t>4. El informe final — 12 secciones (20% del curso)</w:t>
+        <w:t>3. El informe final — 12 secciones (20% del curso)</w:t>
       </w:r>
     </w:p>
     <w:tbl>
@@ -1217,7 +1172,7 @@
           <w:color w:val="095292"/>
           <w:sz w:val="24"/>
         </w:rPr>
-        <w:t>5. La exposición final (15% del curso)</w:t>
+        <w:t>4. La exposición final (15% del curso)</w:t>
       </w:r>
     </w:p>
     <w:p>
@@ -1622,7 +1577,7 @@
           <w:color w:val="095292"/>
           <w:sz w:val="24"/>
         </w:rPr>
-        <w:t>6. Herramientas (gratis + navegador)</w:t>
+        <w:t>5. Herramientas (gratis + navegador)</w:t>
       </w:r>
     </w:p>
     <w:p>
@@ -1728,7 +1683,7 @@
           <w:color w:val="095292"/>
           <w:sz w:val="24"/>
         </w:rPr>
-        <w:t>7. Modalidad de trabajo</w:t>
+        <w:t>6. Modalidad de trabajo</w:t>
       </w:r>
     </w:p>
     <w:p>
@@ -1788,7 +1743,7 @@
           <w:color w:val="095292"/>
           <w:sz w:val="24"/>
         </w:rPr>
-        <w:t>8. Qué NO es este proyecto</w:t>
+        <w:t>7. Qué NO es este proyecto</w:t>
       </w:r>
     </w:p>
     <w:p>

</xml_diff>